<commit_message>
Add third group member's name to report and worksheets
Co-Authored-By: Claude Opus 5.5 <noreply@anthropic.com>
</commit_message>
<xml_diff>
--- a/Manual_Calculation_Worksheets.docx
+++ b/Manual_Calculation_Worksheets.docx
@@ -316,7 +316,7 @@
                 <w:b/>
                 <w:sz w:val="19"/>
               </w:rPr>
-              <w:t>Member 3 (i228780)</w:t>
+              <w:t>Hadeed Abbas (i228780)</w:t>
             </w:r>
           </w:p>
         </w:tc>
@@ -23350,7 +23350,7 @@
         <w:pStyle w:val="Heading1"/>
       </w:pPr>
       <w:r>
-        <w:t>Member 3 (i228780) - File 1: markdown/postprocessors.py</w:t>
+        <w:t>Hadeed Abbas (i228780) - File 1: markdown/postprocessors.py</w:t>
       </w:r>
     </w:p>
     <w:p>
@@ -28130,7 +28130,7 @@
         <w:pStyle w:val="Heading1"/>
       </w:pPr>
       <w:r>
-        <w:t>Member 3 (i228780) - File 2: markdown/extensions/legacy_attrs.py</w:t>
+        <w:t>Hadeed Abbas (i228780) - File 2: markdown/extensions/legacy_attrs.py</w:t>
       </w:r>
     </w:p>
     <w:p>

</xml_diff>

<commit_message>
Add handwritten sheets to the manual calculation worksheets
Each member's three sheets follow their second file. The scan list now lives
in analysis/scan_pages.py and is shared by both document builders.

Co-Authored-By: Claude Opus 5.5 <noreply@anthropic.com>
</commit_message>
<xml_diff>
--- a/Manual_Calculation_Worksheets.docx
+++ b/Manual_Calculation_Worksheets.docx
@@ -10267,6 +10267,216 @@
       <w:pPr>
         <w:spacing w:after="80" w:line="144" w:lineRule="auto"/>
       </w:pPr>
+    </w:p>
+    <w:p>
+      <w:pPr>
+        <w:pStyle w:val="Heading2"/>
+        <w:pageBreakBefore/>
+      </w:pPr>
+      <w:r>
+        <w:t>Handwritten sheets: Taha Yasir (i222429), sheet 1 of 3</w:t>
+      </w:r>
+    </w:p>
+    <w:p>
+      <w:pPr>
+        <w:keepNext/>
+        <w:spacing w:after="40"/>
+        <w:jc w:val="center"/>
+      </w:pPr>
+      <w:r>
+        <w:rPr>
+          <w:noProof/>
+        </w:rPr>
+        <w:drawing>
+          <wp:inline distT="0" distB="0" distL="0" distR="0" wp14:anchorId="2484E8EB" wp14:editId="19E83A1E">
+            <wp:extent cx="5220000" cy="6960000"/>
+            <wp:effectExtent l="0" t="0" r="0" b="0"/>
+            <wp:docPr id="1" name="Picture 1"/>
+            <wp:cNvGraphicFramePr>
+              <a:graphicFrameLocks xmlns:a="http://schemas.openxmlformats.org/drawingml/2006/main" noChangeAspect="1"/>
+            </wp:cNvGraphicFramePr>
+            <a:graphic xmlns:a="http://schemas.openxmlformats.org/drawingml/2006/main">
+              <a:graphicData uri="http://schemas.openxmlformats.org/drawingml/2006/picture">
+                <pic:pic xmlns:pic="http://schemas.openxmlformats.org/drawingml/2006/picture">
+                  <pic:nvPicPr>
+                    <pic:cNvPr id="0" name="taha_1_def_list.jpg"/>
+                    <pic:cNvPicPr/>
+                  </pic:nvPicPr>
+                  <pic:blipFill>
+                    <a:blip r:embed="rId9"/>
+                    <a:stretch>
+                      <a:fillRect/>
+                    </a:stretch>
+                  </pic:blipFill>
+                  <pic:spPr>
+                    <a:xfrm>
+                      <a:off x="0" y="0"/>
+                      <a:ext cx="5220000" cy="6960000"/>
+                    </a:xfrm>
+                    <a:prstGeom prst="rect">
+                      <a:avLst/>
+                    </a:prstGeom>
+                  </pic:spPr>
+                </pic:pic>
+              </a:graphicData>
+            </a:graphic>
+          </wp:inline>
+        </w:drawing>
+      </w:r>
+    </w:p>
+    <w:p>
+      <w:pPr>
+        <w:spacing w:after="160"/>
+        <w:jc w:val="center"/>
+      </w:pPr>
+      <w:r>
+        <w:rPr>
+          <w:i/>
+          <w:color w:val="5A5A5A"/>
+          <w:sz w:val="18"/>
+        </w:rPr>
+        <w:t>def_list.py: comment density, cyclomatic and cognitive complexity</w:t>
+      </w:r>
+    </w:p>
+    <w:p>
+      <w:pPr>
+        <w:pStyle w:val="Heading2"/>
+        <w:pageBreakBefore/>
+      </w:pPr>
+      <w:r>
+        <w:t>Handwritten sheets: Taha Yasir (i222429), sheet 2 of 3</w:t>
+      </w:r>
+    </w:p>
+    <w:p>
+      <w:pPr>
+        <w:keepNext/>
+        <w:spacing w:after="40"/>
+        <w:jc w:val="center"/>
+      </w:pPr>
+      <w:r>
+        <w:rPr>
+          <w:noProof/>
+        </w:rPr>
+        <w:drawing>
+          <wp:inline distT="0" distB="0" distL="0" distR="0" wp14:anchorId="7D0A53F5" wp14:editId="1043CDA6">
+            <wp:extent cx="5220000" cy="6960000"/>
+            <wp:effectExtent l="0" t="0" r="0" b="0"/>
+            <wp:docPr id="2" name="Picture 2"/>
+            <wp:cNvGraphicFramePr>
+              <a:graphicFrameLocks xmlns:a="http://schemas.openxmlformats.org/drawingml/2006/main" noChangeAspect="1"/>
+            </wp:cNvGraphicFramePr>
+            <a:graphic xmlns:a="http://schemas.openxmlformats.org/drawingml/2006/main">
+              <a:graphicData uri="http://schemas.openxmlformats.org/drawingml/2006/picture">
+                <pic:pic xmlns:pic="http://schemas.openxmlformats.org/drawingml/2006/picture">
+                  <pic:nvPicPr>
+                    <pic:cNvPr id="0" name="taha_2_meta.jpg"/>
+                    <pic:cNvPicPr/>
+                  </pic:nvPicPr>
+                  <pic:blipFill>
+                    <a:blip r:embed="rId10"/>
+                    <a:stretch>
+                      <a:fillRect/>
+                    </a:stretch>
+                  </pic:blipFill>
+                  <pic:spPr>
+                    <a:xfrm>
+                      <a:off x="0" y="0"/>
+                      <a:ext cx="5220000" cy="6960000"/>
+                    </a:xfrm>
+                    <a:prstGeom prst="rect">
+                      <a:avLst/>
+                    </a:prstGeom>
+                  </pic:spPr>
+                </pic:pic>
+              </a:graphicData>
+            </a:graphic>
+          </wp:inline>
+        </w:drawing>
+      </w:r>
+    </w:p>
+    <w:p>
+      <w:pPr>
+        <w:spacing w:after="160"/>
+        <w:jc w:val="center"/>
+      </w:pPr>
+      <w:r>
+        <w:rPr>
+          <w:i/>
+          <w:color w:val="5A5A5A"/>
+          <w:sz w:val="18"/>
+        </w:rPr>
+        <w:t>def_list.py summary; meta.py: comment density and cyclomatic complexity</w:t>
+      </w:r>
+    </w:p>
+    <w:p>
+      <w:pPr>
+        <w:pStyle w:val="Heading2"/>
+        <w:pageBreakBefore/>
+      </w:pPr>
+      <w:r>
+        <w:t>Handwritten sheets: Taha Yasir (i222429), sheet 3 of 3</w:t>
+      </w:r>
+    </w:p>
+    <w:p>
+      <w:pPr>
+        <w:keepNext/>
+        <w:spacing w:after="40"/>
+        <w:jc w:val="center"/>
+      </w:pPr>
+      <w:r>
+        <w:rPr>
+          <w:noProof/>
+        </w:rPr>
+        <w:drawing>
+          <wp:inline distT="0" distB="0" distL="0" distR="0" wp14:anchorId="143525A9" wp14:editId="55F27B64">
+            <wp:extent cx="5220000" cy="6960000"/>
+            <wp:effectExtent l="0" t="0" r="0" b="0"/>
+            <wp:docPr id="3" name="Picture 3"/>
+            <wp:cNvGraphicFramePr>
+              <a:graphicFrameLocks xmlns:a="http://schemas.openxmlformats.org/drawingml/2006/main" noChangeAspect="1"/>
+            </wp:cNvGraphicFramePr>
+            <a:graphic xmlns:a="http://schemas.openxmlformats.org/drawingml/2006/main">
+              <a:graphicData uri="http://schemas.openxmlformats.org/drawingml/2006/picture">
+                <pic:pic xmlns:pic="http://schemas.openxmlformats.org/drawingml/2006/picture">
+                  <pic:nvPicPr>
+                    <pic:cNvPr id="0" name="taha_3_meta_cognitive.jpg"/>
+                    <pic:cNvPicPr/>
+                  </pic:nvPicPr>
+                  <pic:blipFill>
+                    <a:blip r:embed="rId11"/>
+                    <a:stretch>
+                      <a:fillRect/>
+                    </a:stretch>
+                  </pic:blipFill>
+                  <pic:spPr>
+                    <a:xfrm>
+                      <a:off x="0" y="0"/>
+                      <a:ext cx="5220000" cy="6960000"/>
+                    </a:xfrm>
+                    <a:prstGeom prst="rect">
+                      <a:avLst/>
+                    </a:prstGeom>
+                  </pic:spPr>
+                </pic:pic>
+              </a:graphicData>
+            </a:graphic>
+          </wp:inline>
+        </w:drawing>
+      </w:r>
+    </w:p>
+    <w:p>
+      <w:pPr>
+        <w:spacing w:after="160"/>
+        <w:jc w:val="center"/>
+      </w:pPr>
+      <w:r>
+        <w:rPr>
+          <w:i/>
+          <w:color w:val="5A5A5A"/>
+          <w:sz w:val="18"/>
+        </w:rPr>
+        <w:t>meta.py: cognitive complexity and summary</w:t>
+      </w:r>
     </w:p>
     <w:p>
       <w:r>
@@ -23230,6 +23440,216 @@
       <w:pPr>
         <w:spacing w:after="80" w:line="144" w:lineRule="auto"/>
       </w:pPr>
+    </w:p>
+    <w:p>
+      <w:pPr>
+        <w:pStyle w:val="Heading2"/>
+        <w:pageBreakBefore/>
+      </w:pPr>
+      <w:r>
+        <w:t>Handwritten sheets: Khizar (i222595), sheet 1 of 3</w:t>
+      </w:r>
+    </w:p>
+    <w:p>
+      <w:pPr>
+        <w:keepNext/>
+        <w:spacing w:after="40"/>
+        <w:jc w:val="center"/>
+      </w:pPr>
+      <w:r>
+        <w:rPr>
+          <w:noProof/>
+        </w:rPr>
+        <w:drawing>
+          <wp:inline distT="0" distB="0" distL="0" distR="0" wp14:anchorId="5274919B" wp14:editId="5D02BED3">
+            <wp:extent cx="5220000" cy="6960000"/>
+            <wp:effectExtent l="0" t="0" r="0" b="0"/>
+            <wp:docPr id="4" name="Picture 4"/>
+            <wp:cNvGraphicFramePr>
+              <a:graphicFrameLocks xmlns:a="http://schemas.openxmlformats.org/drawingml/2006/main" noChangeAspect="1"/>
+            </wp:cNvGraphicFramePr>
+            <a:graphic xmlns:a="http://schemas.openxmlformats.org/drawingml/2006/main">
+              <a:graphicData uri="http://schemas.openxmlformats.org/drawingml/2006/picture">
+                <pic:pic xmlns:pic="http://schemas.openxmlformats.org/drawingml/2006/picture">
+                  <pic:nvPicPr>
+                    <pic:cNvPr id="0" name="khizar_1_admonition.jpg"/>
+                    <pic:cNvPicPr/>
+                  </pic:nvPicPr>
+                  <pic:blipFill>
+                    <a:blip r:embed="rId12"/>
+                    <a:stretch>
+                      <a:fillRect/>
+                    </a:stretch>
+                  </pic:blipFill>
+                  <pic:spPr>
+                    <a:xfrm>
+                      <a:off x="0" y="0"/>
+                      <a:ext cx="5220000" cy="6960000"/>
+                    </a:xfrm>
+                    <a:prstGeom prst="rect">
+                      <a:avLst/>
+                    </a:prstGeom>
+                  </pic:spPr>
+                </pic:pic>
+              </a:graphicData>
+            </a:graphic>
+          </wp:inline>
+        </w:drawing>
+      </w:r>
+    </w:p>
+    <w:p>
+      <w:pPr>
+        <w:spacing w:after="160"/>
+        <w:jc w:val="center"/>
+      </w:pPr>
+      <w:r>
+        <w:rPr>
+          <w:i/>
+          <w:color w:val="5A5A5A"/>
+          <w:sz w:val="18"/>
+        </w:rPr>
+        <w:t>admonition.py: comment density, cyclomatic and cognitive complexity</w:t>
+      </w:r>
+    </w:p>
+    <w:p>
+      <w:pPr>
+        <w:pStyle w:val="Heading2"/>
+        <w:pageBreakBefore/>
+      </w:pPr>
+      <w:r>
+        <w:t>Handwritten sheets: Khizar (i222595), sheet 2 of 3</w:t>
+      </w:r>
+    </w:p>
+    <w:p>
+      <w:pPr>
+        <w:keepNext/>
+        <w:spacing w:after="40"/>
+        <w:jc w:val="center"/>
+      </w:pPr>
+      <w:r>
+        <w:rPr>
+          <w:noProof/>
+        </w:rPr>
+        <w:drawing>
+          <wp:inline distT="0" distB="0" distL="0" distR="0" wp14:anchorId="4D5F847C" wp14:editId="646A6F19">
+            <wp:extent cx="5220000" cy="6960000"/>
+            <wp:effectExtent l="0" t="0" r="0" b="0"/>
+            <wp:docPr id="5" name="Picture 5"/>
+            <wp:cNvGraphicFramePr>
+              <a:graphicFrameLocks xmlns:a="http://schemas.openxmlformats.org/drawingml/2006/main" noChangeAspect="1"/>
+            </wp:cNvGraphicFramePr>
+            <a:graphic xmlns:a="http://schemas.openxmlformats.org/drawingml/2006/main">
+              <a:graphicData uri="http://schemas.openxmlformats.org/drawingml/2006/picture">
+                <pic:pic xmlns:pic="http://schemas.openxmlformats.org/drawingml/2006/picture">
+                  <pic:nvPicPr>
+                    <pic:cNvPr id="0" name="khizar_2_wikilinks.jpg"/>
+                    <pic:cNvPicPr/>
+                  </pic:nvPicPr>
+                  <pic:blipFill>
+                    <a:blip r:embed="rId13"/>
+                    <a:stretch>
+                      <a:fillRect/>
+                    </a:stretch>
+                  </pic:blipFill>
+                  <pic:spPr>
+                    <a:xfrm>
+                      <a:off x="0" y="0"/>
+                      <a:ext cx="5220000" cy="6960000"/>
+                    </a:xfrm>
+                    <a:prstGeom prst="rect">
+                      <a:avLst/>
+                    </a:prstGeom>
+                  </pic:spPr>
+                </pic:pic>
+              </a:graphicData>
+            </a:graphic>
+          </wp:inline>
+        </w:drawing>
+      </w:r>
+    </w:p>
+    <w:p>
+      <w:pPr>
+        <w:spacing w:after="160"/>
+        <w:jc w:val="center"/>
+      </w:pPr>
+      <w:r>
+        <w:rPr>
+          <w:i/>
+          <w:color w:val="5A5A5A"/>
+          <w:sz w:val="18"/>
+        </w:rPr>
+        <w:t>admonition.py summary; wikilinks.py: comment density and cyclomatic complexity</w:t>
+      </w:r>
+    </w:p>
+    <w:p>
+      <w:pPr>
+        <w:pStyle w:val="Heading2"/>
+        <w:pageBreakBefore/>
+      </w:pPr>
+      <w:r>
+        <w:t>Handwritten sheets: Khizar (i222595), sheet 3 of 3</w:t>
+      </w:r>
+    </w:p>
+    <w:p>
+      <w:pPr>
+        <w:keepNext/>
+        <w:spacing w:after="40"/>
+        <w:jc w:val="center"/>
+      </w:pPr>
+      <w:r>
+        <w:rPr>
+          <w:noProof/>
+        </w:rPr>
+        <w:drawing>
+          <wp:inline distT="0" distB="0" distL="0" distR="0" wp14:anchorId="6234FB0E" wp14:editId="25903449">
+            <wp:extent cx="5220000" cy="6960000"/>
+            <wp:effectExtent l="0" t="0" r="0" b="0"/>
+            <wp:docPr id="6" name="Picture 6"/>
+            <wp:cNvGraphicFramePr>
+              <a:graphicFrameLocks xmlns:a="http://schemas.openxmlformats.org/drawingml/2006/main" noChangeAspect="1"/>
+            </wp:cNvGraphicFramePr>
+            <a:graphic xmlns:a="http://schemas.openxmlformats.org/drawingml/2006/main">
+              <a:graphicData uri="http://schemas.openxmlformats.org/drawingml/2006/picture">
+                <pic:pic xmlns:pic="http://schemas.openxmlformats.org/drawingml/2006/picture">
+                  <pic:nvPicPr>
+                    <pic:cNvPr id="0" name="khizar_3_wikilinks_cognitive.jpg"/>
+                    <pic:cNvPicPr/>
+                  </pic:nvPicPr>
+                  <pic:blipFill>
+                    <a:blip r:embed="rId14"/>
+                    <a:stretch>
+                      <a:fillRect/>
+                    </a:stretch>
+                  </pic:blipFill>
+                  <pic:spPr>
+                    <a:xfrm>
+                      <a:off x="0" y="0"/>
+                      <a:ext cx="5220000" cy="6960000"/>
+                    </a:xfrm>
+                    <a:prstGeom prst="rect">
+                      <a:avLst/>
+                    </a:prstGeom>
+                  </pic:spPr>
+                </pic:pic>
+              </a:graphicData>
+            </a:graphic>
+          </wp:inline>
+        </w:drawing>
+      </w:r>
+    </w:p>
+    <w:p>
+      <w:pPr>
+        <w:spacing w:after="160"/>
+        <w:jc w:val="center"/>
+      </w:pPr>
+      <w:r>
+        <w:rPr>
+          <w:i/>
+          <w:color w:val="5A5A5A"/>
+          <w:sz w:val="18"/>
+        </w:rPr>
+        <w:t>wikilinks.py: cognitive complexity and summary</w:t>
+      </w:r>
     </w:p>
     <w:p>
       <w:r>
@@ -31159,8 +31579,218 @@
         <w:spacing w:after="80" w:line="144" w:lineRule="auto"/>
       </w:pPr>
     </w:p>
+    <w:p>
+      <w:pPr>
+        <w:pStyle w:val="Heading2"/>
+        <w:pageBreakBefore/>
+      </w:pPr>
+      <w:r>
+        <w:t>Handwritten sheets: Hadeed Abbas (i228780), sheet 1 of 3</w:t>
+      </w:r>
+    </w:p>
+    <w:p>
+      <w:pPr>
+        <w:keepNext/>
+        <w:spacing w:after="40"/>
+        <w:jc w:val="center"/>
+      </w:pPr>
+      <w:r>
+        <w:rPr>
+          <w:noProof/>
+        </w:rPr>
+        <w:drawing>
+          <wp:inline distT="0" distB="0" distL="0" distR="0" wp14:anchorId="28329316" wp14:editId="3741802B">
+            <wp:extent cx="5220000" cy="6960000"/>
+            <wp:effectExtent l="0" t="0" r="0" b="0"/>
+            <wp:docPr id="7" name="Picture 7"/>
+            <wp:cNvGraphicFramePr>
+              <a:graphicFrameLocks xmlns:a="http://schemas.openxmlformats.org/drawingml/2006/main" noChangeAspect="1"/>
+            </wp:cNvGraphicFramePr>
+            <a:graphic xmlns:a="http://schemas.openxmlformats.org/drawingml/2006/main">
+              <a:graphicData uri="http://schemas.openxmlformats.org/drawingml/2006/picture">
+                <pic:pic xmlns:pic="http://schemas.openxmlformats.org/drawingml/2006/picture">
+                  <pic:nvPicPr>
+                    <pic:cNvPr id="0" name="hadeed_1_postprocessors.jpg"/>
+                    <pic:cNvPicPr/>
+                  </pic:nvPicPr>
+                  <pic:blipFill>
+                    <a:blip r:embed="rId15"/>
+                    <a:stretch>
+                      <a:fillRect/>
+                    </a:stretch>
+                  </pic:blipFill>
+                  <pic:spPr>
+                    <a:xfrm>
+                      <a:off x="0" y="0"/>
+                      <a:ext cx="5220000" cy="6960000"/>
+                    </a:xfrm>
+                    <a:prstGeom prst="rect">
+                      <a:avLst/>
+                    </a:prstGeom>
+                  </pic:spPr>
+                </pic:pic>
+              </a:graphicData>
+            </a:graphic>
+          </wp:inline>
+        </w:drawing>
+      </w:r>
+    </w:p>
+    <w:p>
+      <w:pPr>
+        <w:spacing w:after="160"/>
+        <w:jc w:val="center"/>
+      </w:pPr>
+      <w:r>
+        <w:rPr>
+          <w:i/>
+          <w:color w:val="5A5A5A"/>
+          <w:sz w:val="18"/>
+        </w:rPr>
+        <w:t>postprocessors.py: comment density and cyclomatic complexity</w:t>
+      </w:r>
+    </w:p>
+    <w:p>
+      <w:pPr>
+        <w:pStyle w:val="Heading2"/>
+        <w:pageBreakBefore/>
+      </w:pPr>
+      <w:r>
+        <w:t>Handwritten sheets: Hadeed Abbas (i228780), sheet 2 of 3</w:t>
+      </w:r>
+    </w:p>
+    <w:p>
+      <w:pPr>
+        <w:keepNext/>
+        <w:spacing w:after="40"/>
+        <w:jc w:val="center"/>
+      </w:pPr>
+      <w:r>
+        <w:rPr>
+          <w:noProof/>
+        </w:rPr>
+        <w:drawing>
+          <wp:inline distT="0" distB="0" distL="0" distR="0" wp14:anchorId="66DECEE8" wp14:editId="0CB47998">
+            <wp:extent cx="5220000" cy="6960000"/>
+            <wp:effectExtent l="0" t="0" r="0" b="0"/>
+            <wp:docPr id="8" name="Picture 8"/>
+            <wp:cNvGraphicFramePr>
+              <a:graphicFrameLocks xmlns:a="http://schemas.openxmlformats.org/drawingml/2006/main" noChangeAspect="1"/>
+            </wp:cNvGraphicFramePr>
+            <a:graphic xmlns:a="http://schemas.openxmlformats.org/drawingml/2006/main">
+              <a:graphicData uri="http://schemas.openxmlformats.org/drawingml/2006/picture">
+                <pic:pic xmlns:pic="http://schemas.openxmlformats.org/drawingml/2006/picture">
+                  <pic:nvPicPr>
+                    <pic:cNvPr id="0" name="hadeed_2_legacy_attrs.jpg"/>
+                    <pic:cNvPicPr/>
+                  </pic:nvPicPr>
+                  <pic:blipFill>
+                    <a:blip r:embed="rId16"/>
+                    <a:stretch>
+                      <a:fillRect/>
+                    </a:stretch>
+                  </pic:blipFill>
+                  <pic:spPr>
+                    <a:xfrm>
+                      <a:off x="0" y="0"/>
+                      <a:ext cx="5220000" cy="6960000"/>
+                    </a:xfrm>
+                    <a:prstGeom prst="rect">
+                      <a:avLst/>
+                    </a:prstGeom>
+                  </pic:spPr>
+                </pic:pic>
+              </a:graphicData>
+            </a:graphic>
+          </wp:inline>
+        </w:drawing>
+      </w:r>
+    </w:p>
+    <w:p>
+      <w:pPr>
+        <w:spacing w:after="160"/>
+        <w:jc w:val="center"/>
+      </w:pPr>
+      <w:r>
+        <w:rPr>
+          <w:i/>
+          <w:color w:val="5A5A5A"/>
+          <w:sz w:val="18"/>
+        </w:rPr>
+        <w:t>postprocessors.py cognitive complexity and summary; legacy_attrs.py: comment density</w:t>
+      </w:r>
+    </w:p>
+    <w:p>
+      <w:pPr>
+        <w:pStyle w:val="Heading2"/>
+        <w:pageBreakBefore/>
+      </w:pPr>
+      <w:r>
+        <w:t>Handwritten sheets: Hadeed Abbas (i228780), sheet 3 of 3</w:t>
+      </w:r>
+    </w:p>
+    <w:p>
+      <w:pPr>
+        <w:keepNext/>
+        <w:spacing w:after="40"/>
+        <w:jc w:val="center"/>
+      </w:pPr>
+      <w:r>
+        <w:rPr>
+          <w:noProof/>
+        </w:rPr>
+        <w:drawing>
+          <wp:inline distT="0" distB="0" distL="0" distR="0" wp14:anchorId="02A9717F" wp14:editId="3973CE3C">
+            <wp:extent cx="5220000" cy="6960000"/>
+            <wp:effectExtent l="0" t="0" r="0" b="0"/>
+            <wp:docPr id="9" name="Picture 9"/>
+            <wp:cNvGraphicFramePr>
+              <a:graphicFrameLocks xmlns:a="http://schemas.openxmlformats.org/drawingml/2006/main" noChangeAspect="1"/>
+            </wp:cNvGraphicFramePr>
+            <a:graphic xmlns:a="http://schemas.openxmlformats.org/drawingml/2006/main">
+              <a:graphicData uri="http://schemas.openxmlformats.org/drawingml/2006/picture">
+                <pic:pic xmlns:pic="http://schemas.openxmlformats.org/drawingml/2006/picture">
+                  <pic:nvPicPr>
+                    <pic:cNvPr id="0" name="hadeed_3_legacy_attrs_cognitive.jpg"/>
+                    <pic:cNvPicPr/>
+                  </pic:nvPicPr>
+                  <pic:blipFill>
+                    <a:blip r:embed="rId17"/>
+                    <a:stretch>
+                      <a:fillRect/>
+                    </a:stretch>
+                  </pic:blipFill>
+                  <pic:spPr>
+                    <a:xfrm>
+                      <a:off x="0" y="0"/>
+                      <a:ext cx="5220000" cy="6960000"/>
+                    </a:xfrm>
+                    <a:prstGeom prst="rect">
+                      <a:avLst/>
+                    </a:prstGeom>
+                  </pic:spPr>
+                </pic:pic>
+              </a:graphicData>
+            </a:graphic>
+          </wp:inline>
+        </w:drawing>
+      </w:r>
+    </w:p>
+    <w:p>
+      <w:pPr>
+        <w:spacing w:after="160"/>
+        <w:jc w:val="center"/>
+      </w:pPr>
+      <w:r>
+        <w:rPr>
+          <w:i/>
+          <w:color w:val="5A5A5A"/>
+          <w:sz w:val="18"/>
+        </w:rPr>
+        <w:t>legacy_attrs.py: cyclomatic and cognitive complexity, summary</w:t>
+      </w:r>
+    </w:p>
     <w:sectPr>
-      <w:footerReference w:type="default" r:id="rId9"/>
+      <w:footerReference w:type="default" r:id="rId18"/>
       <w:pgSz w:w="11906" w:h="16838"/>
       <w:pgMar w:top="1134" w:right="1134" w:bottom="1077" w:left="1134" w:header="720" w:footer="720" w:gutter="0"/>
       <w:cols w:space="720"/>
@@ -31446,31 +32076,31 @@
       </w:rPr>
     </w:lvl>
   </w:abstractNum>
-  <w:num w:numId="1" w16cid:durableId="497772105">
+  <w:num w:numId="1" w16cid:durableId="1412317246">
     <w:abstractNumId w:val="8"/>
   </w:num>
-  <w:num w:numId="2" w16cid:durableId="1124423807">
+  <w:num w:numId="2" w16cid:durableId="1525360888">
     <w:abstractNumId w:val="6"/>
   </w:num>
-  <w:num w:numId="3" w16cid:durableId="285889497">
+  <w:num w:numId="3" w16cid:durableId="1960988036">
     <w:abstractNumId w:val="5"/>
   </w:num>
-  <w:num w:numId="4" w16cid:durableId="488862165">
+  <w:num w:numId="4" w16cid:durableId="861868836">
     <w:abstractNumId w:val="4"/>
   </w:num>
-  <w:num w:numId="5" w16cid:durableId="1587348294">
+  <w:num w:numId="5" w16cid:durableId="1367411132">
     <w:abstractNumId w:val="7"/>
   </w:num>
-  <w:num w:numId="6" w16cid:durableId="1755130082">
+  <w:num w:numId="6" w16cid:durableId="768818484">
     <w:abstractNumId w:val="3"/>
   </w:num>
-  <w:num w:numId="7" w16cid:durableId="2106145311">
+  <w:num w:numId="7" w16cid:durableId="2097432971">
     <w:abstractNumId w:val="2"/>
   </w:num>
-  <w:num w:numId="8" w16cid:durableId="1336110415">
+  <w:num w:numId="8" w16cid:durableId="1786458861">
     <w:abstractNumId w:val="1"/>
   </w:num>
-  <w:num w:numId="9" w16cid:durableId="551237454">
+  <w:num w:numId="9" w16cid:durableId="1352142648">
     <w:abstractNumId w:val="0"/>
   </w:num>
 </w:numbering>

</xml_diff>